<commit_message>
Ajustes no relatório técnico
</commit_message>
<xml_diff>
--- a/presentation/[RT_ADIA] VRUM_Relatorio_Tecnico.docx
+++ b/presentation/[RT_ADIA] VRUM_Relatorio_Tecnico.docx
@@ -25,7 +25,7 @@
           <w:szCs w:val="24"/>
           <w:rtl w:val="0"/>
         </w:rPr>
-        <w:t xml:space="preserve">RESIDÊNCIA TECNOLÓGICA EM DADOS E IA</w:t>
+        <w:t>RESIDÊNCIA TECNOLÓGICA EM ANÁLISE DE DADOS E IA</w:t>
       </w:r>
     </w:p>
     <w:p>
@@ -169,7 +169,7 @@
           <w:szCs w:val="24"/>
           <w:rtl w:val="0"/>
         </w:rPr>
-        <w:t xml:space="preserve">VRUM - Validação de Risco em Unidades Motoras </w:t>
+        <w:t xml:space="preserve">VRUM - Verificação de Risco e Uso de Motores </w:t>
       </w:r>
       <w:r>
         <w:rPr>
@@ -270,7 +270,7 @@
           <w:szCs w:val="21"/>
           <w:rtl w:val="0"/>
         </w:rPr>
-        <w:t xml:space="preserve">Projeto VRUM (Validação de Risco em Unidades Motoras)</w:t>
+        <w:t>Projeto VRUM (Verificação de Risco e Uso de Motores)</w:t>
       </w:r>
       <w:r>
         <w:rPr>
@@ -652,7 +652,7 @@
                 <w:szCs w:val="21"/>
                 <w:rtl w:val="0"/>
               </w:rPr>
-              <w:t xml:space="preserve">VRUM Validação de Risco em Unidades Motoras </w:t>
+              <w:t xml:space="preserve">VRUM Verificação de Risco e Uso de Motores </w:t>
             </w:r>
             <w:r>
               <w:rPr>
@@ -1215,7 +1215,7 @@
           <w:bCs w:val="1"/>
           <w:rtl w:val="0"/>
         </w:rPr>
-        <w:t xml:space="preserve">VRUM (Validação de Risco em Unidades Motoras)</w:t>
+        <w:t>VRUM (Verificação de Risco e Uso de Motores)</w:t>
       </w:r>
       <w:r>
         <w:rPr>
@@ -1902,7 +1902,6 @@
     </w:p>
     <w:p>
       <w:pPr>
-        <w:pStyle w:val="Heading1"/>
         <w:spacing w:before="420" w:lineRule="auto"/>
         <w:jc w:val="both"/>
         <w:rPr>
@@ -1955,7 +1954,6 @@
     </w:p>
     <w:p>
       <w:pPr>
-        <w:pStyle w:val="Heading1"/>
         <w:spacing w:before="420" w:lineRule="auto"/>
         <w:jc w:val="both"/>
         <w:rPr>
@@ -1984,7 +1982,6 @@
     </w:p>
     <w:p>
       <w:pPr>
-        <w:pStyle w:val="Heading1"/>
         <w:spacing w:before="420" w:lineRule="auto"/>
         <w:jc w:val="both"/>
         <w:rPr>
@@ -2013,7 +2010,6 @@
     </w:p>
     <w:p>
       <w:pPr>
-        <w:pStyle w:val="Heading1"/>
         <w:spacing w:before="420" w:lineRule="auto"/>
         <w:jc w:val="both"/>
         <w:rPr>
@@ -2078,7 +2074,6 @@
     </w:p>
     <w:p>
       <w:pPr>
-        <w:pStyle w:val="Heading1"/>
         <w:spacing w:before="420" w:lineRule="auto"/>
         <w:jc w:val="both"/>
         <w:rPr>
@@ -2560,16 +2555,16 @@
           <w:rFonts w:ascii="Barlow" w:cs="Barlow" w:eastAsia="Barlow" w:hAnsi="Barlow"/>
           <w:rtl w:val="0"/>
         </w:rPr>
-        <w:t xml:space="preserve">Diante do desempenho observado na base sintética, a zona de </w:t>
-      </w:r>
-      <w:r>
-        <w:rPr>
-          <w:rFonts w:ascii="Barlow" w:cs="Barlow" w:eastAsia="Barlow" w:hAnsi="Barlow"/>
-          <w:b w:val="1"/>
-          <w:bCs w:val="1"/>
-          <w:rtl w:val="0"/>
-        </w:rPr>
-        <w:t xml:space="preserve">BLOQUEIO AUTOMÁTICO permaneceu desativada</w:t>
+        <w:t xml:space="preserve">Diante do desempenho observado na base sintética, a zona </w:t>
+      </w:r>
+      <w:r>
+        <w:rPr>
+          <w:rFonts w:ascii="Barlow" w:cs="Barlow" w:eastAsia="Barlow" w:hAnsi="Barlow"/>
+          <w:b w:val="1"/>
+          <w:bCs w:val="1"/>
+          <w:rtl w:val="0"/>
+        </w:rPr>
+        <w:t>BLOQUEAR permaneceu desativada</w:t>
       </w:r>
       <w:r>
         <w:rPr>
@@ -2629,7 +2624,6 @@
     </w:p>
     <w:p>
       <w:pPr>
-        <w:pStyle w:val="Heading1"/>
         <w:numPr>
           <w:ilvl w:val="0"/>
           <w:numId w:val="8"/>
@@ -3013,7 +3007,7 @@
                 <w:szCs w:val="21"/>
                 <w:rtl w:val="0"/>
               </w:rPr>
-              <w:t xml:space="preserve">Quantidade de atributos</w:t>
+              <w:t>Atributos (11)</w:t>
             </w:r>
             <w:r>
               <w:rPr>
@@ -3239,7 +3233,6 @@
     </w:p>
     <w:p>
       <w:pPr>
-        <w:pStyle w:val="Heading1"/>
         <w:spacing w:after="180" w:before="180" w:lineRule="auto"/>
         <w:jc w:val="both"/>
         <w:rPr>
@@ -3261,7 +3254,7 @@
           <w:szCs w:val="22"/>
           <w:rtl w:val="0"/>
         </w:rPr>
-        <w:t xml:space="preserve">A etapa de entendimento dos dados teve como objetivo avaliar a estrutura e a completude das informações disponíveis e identificar quais atributos poderiam ser utilizados na reconstrução da trajetória dos veículos. A auditoria inicial verificou que as variáveis originais não apresentavam valores nulos. Entretanto, a ausência de dados faltantes não significava que a base contivesse, de forma explícita, todas as informações comportamentais necessárias à análise de risco.</w:t>
+        <w:t>A etapa de entendimento dos dados teve como objetivo avaliar a estrutura e a completude das informações disponíveis e identificar quais atributos poderiam ser utilizados na reconstrução da trajetória dos veículos.</w:t>
       </w:r>
     </w:p>
     <w:p>
@@ -3594,7 +3587,6 @@
     </w:p>
     <w:p>
       <w:pPr>
-        <w:pStyle w:val="Heading1"/>
         <w:spacing w:after="180" w:before="180" w:lineRule="auto"/>
         <w:jc w:val="both"/>
         <w:rPr>
@@ -3623,7 +3615,6 @@
     </w:p>
     <w:p>
       <w:pPr>
-        <w:pStyle w:val="Heading1"/>
         <w:spacing w:after="180" w:before="180" w:lineRule="auto"/>
         <w:jc w:val="both"/>
         <w:rPr>
@@ -3652,7 +3643,6 @@
     </w:p>
     <w:p>
       <w:pPr>
-        <w:pStyle w:val="Heading1"/>
         <w:spacing w:after="180" w:before="180" w:lineRule="auto"/>
         <w:jc w:val="both"/>
         <w:rPr>
@@ -3681,7 +3671,6 @@
     </w:p>
     <w:p>
       <w:pPr>
-        <w:pStyle w:val="Heading1"/>
         <w:spacing w:after="180" w:before="180" w:lineRule="auto"/>
         <w:jc w:val="both"/>
         <w:rPr>
@@ -3722,7 +3711,6 @@
     </w:p>
     <w:p>
       <w:pPr>
-        <w:pStyle w:val="Heading1"/>
         <w:spacing w:after="180" w:before="180" w:lineRule="auto"/>
         <w:jc w:val="both"/>
         <w:rPr>
@@ -3863,22 +3851,6 @@
         <w:rPr>
           <w:rtl w:val="0"/>
         </w:rPr>
-      </w:r>
-    </w:p>
-    <w:p>
-      <w:pPr>
-        <w:spacing w:after="180" w:before="180" w:lineRule="auto"/>
-        <w:jc w:val="both"/>
-        <w:rPr>
-          <w:rFonts w:ascii="Barlow" w:cs="Barlow" w:eastAsia="Barlow" w:hAnsi="Barlow"/>
-        </w:rPr>
-      </w:pPr>
-      <w:r>
-        <w:rPr>
-          <w:rFonts w:ascii="Barlow" w:cs="Barlow" w:eastAsia="Barlow" w:hAnsi="Barlow"/>
-          <w:rtl w:val="0"/>
-        </w:rPr>
-        <w:t xml:space="preserve">A preparação dos dados teve como objetivo adequar a base para as etapas de modelagem e análise de risco, preservando a dimensão temporal das informações e evitando o uso de dados futuros na construção das variáveis. Como a base sintética já apresentava estrutura padronizada e não possuía valores nulos nas variáveis originais, não foram necessárias etapas extensivas de correção ou imputação. O trabalho concentrou-se na adequação do processamento, na organização temporal dos registros e na criação de atributos derivados da trajetória dos chassis.</w:t>
       </w:r>
     </w:p>
     <w:p>
@@ -4782,7 +4754,7 @@
           <w:color w:val="000000"/>
           <w:rtl w:val="0"/>
         </w:rPr>
-        <w:t xml:space="preserve">Os modelos criados:</w:t>
+        <w:t>Os indicadores criados:</w:t>
       </w:r>
       <w:r>
         <w:rPr>
@@ -6429,55 +6401,6 @@
         </w:rPr>
       </w:pPr>
       <w:r>
-        <w:rPr>
-          <w:rFonts w:ascii="Barlow" w:cs="Barlow" w:eastAsia="Barlow" w:hAnsi="Barlow"/>
-          <w:i w:val="1"/>
-          <w:iCs w:val="1"/>
-          <w:rtl w:val="0"/>
-        </w:rPr>
-        <w:t xml:space="preserve">A preparação partiu da base bruta de propostas e eventos de risco por chassi. Na limpeza e tratamento, os tipos de dados foram otimizados (texto convertido para category, datetime separado em data e hora) e o processamento foi migrado de Pandas para Polars para viabilizar o volume de 2,1 milhões de registros em tempo hábil. Na transformação, os eventos brutos de cada chassi foram ordenados cronologicamente para reconstruir sua linha do tempo completa de propriedade.</w:t>
-        <w:br w:type="textWrapping"/>
-        <w:br w:type="textWrapping"/>
-      </w:r>
-      <w:r>
-        <w:rPr>
-          <w:rFonts w:ascii="Barlow" w:cs="Barlow" w:eastAsia="Barlow" w:hAnsi="Barlow"/>
-          <w:rtl w:val="0"/>
-        </w:rPr>
-        <w:t xml:space="preserve"> A partir dela, a engenharia de atributos derivou, usando apenas informação disponível até o momento da proposta (anti-leakage): contagens de trocas em janelas de 7/15/30/90 dias, tempo de permanência (atual, anterior, média e mediana), sequência de tipo de proprietário (PF/PJ), intervalo entre passagens sucessivas, quantidade de propostas históricas por chassi, LTV (razão entre valor financiado e FIPE) e quantidade de sinais de mesa acumulados. O target foi definido com uma janela de performance de 90 dias e o split treino/teste seguiu um corte temporal estrito de 30 dias, evitando vazamento de informação futura no treinamento.</w:t>
-      </w:r>
-    </w:p>
-    <w:p>
-      <w:pPr>
-        <w:spacing w:after="240" w:lineRule="auto"/>
-        <w:jc w:val="both"/>
-        <w:rPr>
-          <w:rFonts w:ascii="Barlow" w:cs="Barlow" w:eastAsia="Barlow" w:hAnsi="Barlow"/>
-          <w:i w:val="1"/>
-          <w:iCs w:val="1"/>
-          <w:color w:val="9aa3b2"/>
-        </w:rPr>
-      </w:pPr>
-      <w:r>
-        <w:rPr>
-          <w:rFonts w:ascii="Barlow" w:cs="Barlow" w:eastAsia="Barlow" w:hAnsi="Barlow"/>
-          <w:i w:val="1"/>
-          <w:iCs w:val="1"/>
-          <w:color w:val="9aa3b2"/>
-          <w:rtl w:val="0"/>
-        </w:rPr>
-        <w:t xml:space="preserve"> </w:t>
-      </w:r>
-    </w:p>
-    <w:p>
-      <w:pPr>
-        <w:spacing w:after="240" w:lineRule="auto"/>
-        <w:jc w:val="both"/>
-        <w:rPr>
-          <w:rFonts w:ascii="Barlow" w:cs="Barlow" w:eastAsia="Barlow" w:hAnsi="Barlow"/>
-        </w:rPr>
-      </w:pPr>
-      <w:r>
         <w:br w:type="page"/>
       </w:r>
       <w:r>
@@ -6514,7 +6437,7 @@
         <w:rPr>
           <w:rtl w:val="0"/>
         </w:rPr>
-        <w:t xml:space="preserve">7. </w:t>
+        <w:t xml:space="preserve">7.1 </w:t>
       </w:r>
       <w:r>
         <w:rPr>
@@ -7242,7 +7165,7 @@
     </w:p>
     <w:p>
       <w:pPr>
-        <w:pStyle w:val="Heading2"/>
+        <w:pStyle w:val="Heading3"/>
         <w:rPr/>
       </w:pPr>
       <w:bookmarkStart w:colFirst="0" w:colLast="0" w:name="_dtcja0gvu84t" w:id="21"/>
@@ -9113,24 +9036,6 @@
         </w:rPr>
       </w:pPr>
       <w:r>
-        <w:br w:type="page"/>
-      </w:r>
-      <w:r>
-        <w:rPr>
-          <w:rtl w:val="0"/>
-        </w:rPr>
-      </w:r>
-    </w:p>
-    <w:p>
-      <w:pPr>
-        <w:pStyle w:val="Heading1"/>
-        <w:spacing w:after="160" w:before="420" w:lineRule="auto"/>
-        <w:jc w:val="both"/>
-        <w:rPr>
-          <w:rFonts w:ascii="Barlow" w:cs="Barlow" w:eastAsia="Barlow" w:hAnsi="Barlow"/>
-        </w:rPr>
-      </w:pPr>
-      <w:r>
         <w:rPr>
           <w:rFonts w:ascii="Barlow" w:cs="Barlow" w:eastAsia="Barlow" w:hAnsi="Barlow"/>
           <w:rtl w:val="0"/>
@@ -9435,34 +9340,6 @@
           <w:rtl w:val="0"/>
         </w:rPr>
         <w:t xml:space="preserve">12. Referências</w:t>
-      </w:r>
-    </w:p>
-    <w:p>
-      <w:pPr>
-        <w:spacing w:after="200" w:lineRule="auto"/>
-        <w:jc w:val="both"/>
-        <w:rPr>
-          <w:rFonts w:ascii="Barlow" w:cs="Barlow" w:eastAsia="Barlow" w:hAnsi="Barlow"/>
-          <w:i w:val="1"/>
-          <w:iCs w:val="1"/>
-        </w:rPr>
-      </w:pPr>
-      <w:r>
-        <w:rPr>
-          <w:rFonts w:ascii="Barlow" w:cs="Barlow" w:eastAsia="Barlow" w:hAnsi="Barlow"/>
-          <w:i w:val="1"/>
-          <w:iCs w:val="1"/>
-          <w:color w:val="7a8399"/>
-          <w:sz w:val="21"/>
-          <w:szCs w:val="21"/>
-          <w:rtl w:val="0"/>
-        </w:rPr>
-        <w:t xml:space="preserve">➔ Liste a bibliografia e fontes utilizadas.</w:t>
-      </w:r>
-      <w:r>
-        <w:rPr>
-          <w:rtl w:val="0"/>
-        </w:rPr>
       </w:r>
     </w:p>
     <w:p>
@@ -9555,7 +9432,7 @@
           <w:rFonts w:ascii="Barlow" w:cs="Barlow" w:eastAsia="Barlow" w:hAnsi="Barlow"/>
           <w:rtl w:val="0"/>
         </w:rPr>
-        <w:t xml:space="preserve">p. 785-794. DOI: 10.1145/2939672.2939785. Acesso em: 25 ago. 2026.</w:t>
+        <w:t>Acesso em: 25 ago. 2026.</w:t>
       </w:r>
     </w:p>
     <w:p>
@@ -9580,7 +9457,7 @@
           <w:rFonts w:ascii="Barlow" w:cs="Barlow" w:eastAsia="Barlow" w:hAnsi="Barlow"/>
           <w:rtl w:val="0"/>
         </w:rPr>
-        <w:t xml:space="preserve"> VRUM — Verificação de Risco e Uso de Motores. GitHub, 2026. Repositório do projeto. Disponível em: [URL do repositório]. </w:t>
+        <w:t xml:space="preserve"> VRUM — Verificação de Risco e Uso de Motores. GitHub, 2026. Repositório do projeto. Disponível em: https://github.com/andpax/vrum. </w:t>
       </w:r>
     </w:p>
     <w:p>

</xml_diff>